<commit_message>
nuevo contenido en la guia y mejoras al PDF
</commit_message>
<xml_diff>
--- a/Guanga_Daniel_AnaDisSis_U1.docx
+++ b/Guanga_Daniel_AnaDisSis_U1.docx
@@ -2,74 +2,130 @@
 <file path=word/document.xml><?xml version="1.0" encoding="utf-8"?>
 <w:document xmlns:wpc="http://schemas.microsoft.com/office/word/2010/wordprocessingCanvas" xmlns:mo="http://schemas.microsoft.com/office/mac/office/2008/main" xmlns:mc="http://schemas.openxmlformats.org/markup-compatibility/2006" xmlns:mv="urn:schemas-microsoft-com:mac:vml" xmlns:o="urn:schemas-microsoft-com:office:office" xmlns:r="http://schemas.openxmlformats.org/officeDocument/2006/relationships" xmlns:m="http://schemas.openxmlformats.org/officeDocument/2006/math" xmlns:v="urn:schemas-microsoft-com:vml" xmlns:wp14="http://schemas.microsoft.com/office/word/2010/wordprocessingDrawing" xmlns:wp="http://schemas.openxmlformats.org/drawingml/2006/wordprocessingDrawing" xmlns:w10="urn:schemas-microsoft-com:office:word" xmlns:w="http://schemas.openxmlformats.org/wordprocessingml/2006/main" xmlns:w14="http://schemas.microsoft.com/office/word/2010/wordml" xmlns:wpg="http://schemas.microsoft.com/office/word/2010/wordprocessingGroup" xmlns:wpi="http://schemas.microsoft.com/office/word/2010/wordprocessingInk" xmlns:wne="http://schemas.microsoft.com/office/word/2006/wordml" xmlns:wps="http://schemas.microsoft.com/office/word/2010/wordprocessingShape" mc:Ignorable="w14 wp14">
   <w:body>
+    <w:p/>
+    <w:p/>
+    <w:p/>
+    <w:p/>
+    <w:p/>
+    <w:p/>
     <w:p>
       <w:pPr>
+        <w:ind w:firstLine="0"/>
         <w:jc w:val="center"/>
       </w:pPr>
       <w:r>
         <w:rPr>
           <w:b/>
         </w:rPr>
-        <w:t>INFORME: MISION, VISION Y VALORES</w:t>
+        <w:t>Mision, Vision y Valores de Pangust Systems</w:t>
       </w:r>
     </w:p>
     <w:p>
       <w:pPr>
+        <w:ind w:firstLine="0"/>
         <w:jc w:val="center"/>
       </w:pPr>
       <w:r>
-        <w:t>Empresa analizada: Pangust Systems</w:t>
+        <w:t>Daniel Guanga, Leo Vasconez, Xavier Siguachi</w:t>
       </w:r>
     </w:p>
     <w:p>
       <w:pPr>
+        <w:ind w:firstLine="0"/>
         <w:jc w:val="center"/>
       </w:pPr>
       <w:r>
-        <w:t>Asignatura: Analisis y Diseno de Sistemas</w:t>
+        <w:t>Universidad Politecnica Salesiana</w:t>
       </w:r>
     </w:p>
     <w:p>
       <w:pPr>
+        <w:ind w:firstLine="0"/>
         <w:jc w:val="center"/>
       </w:pPr>
       <w:r>
-        <w:t>Grupo: 2 - Computacion - CUE</w:t>
+        <w:t>Analisis y Diseno de Sistemas</w:t>
       </w:r>
     </w:p>
     <w:p>
       <w:pPr>
+        <w:ind w:firstLine="0"/>
         <w:jc w:val="center"/>
       </w:pPr>
       <w:r>
-        <w:t>Integrantes: Daniel Guanga, Leo Vasconez, Xavier Siguachi</w:t>
+        <w:t>Grupo 2 - Computacion - CUE</w:t>
       </w:r>
     </w:p>
-    <w:p/>
     <w:p>
+      <w:pPr>
+        <w:ind w:firstLine="0"/>
+        <w:jc w:val="center"/>
+      </w:pPr>
+      <w:r>
+        <w:t>Docente: Ing. Diana Arce Cuesta</w:t>
+      </w:r>
+    </w:p>
+    <w:p>
+      <w:pPr>
+        <w:ind w:firstLine="0"/>
+        <w:jc w:val="center"/>
+      </w:pPr>
+      <w:r>
+        <w:t>22/04/2026</w:t>
+      </w:r>
+    </w:p>
+    <w:p>
+      <w:r>
+        <w:br w:type="page"/>
+      </w:r>
+    </w:p>
+    <w:p>
+      <w:pPr>
+        <w:ind w:firstLine="0"/>
+      </w:pPr>
       <w:r>
         <w:rPr>
           <w:b/>
         </w:rPr>
-        <w:t>1. Tema y contexto</w:t>
+        <w:t>Mision</w:t>
       </w:r>
     </w:p>
     <w:p>
       <w:r>
-        <w:t>Pangust Systems es una empresa de base tecnologica creada para ofrecer desarrollo de software, automatizacion de procesos y servicios de ciberseguridad para pymes. Este informe define su mision, vision y valores considerando el momento de analisis (marzo de 2022).</w:t>
+        <w:t>Desarrollar soluciones tecnologicas integrales para pymes, combinando software, automatizacion y ciberseguridad, para mejorar su eficiencia, proteger su informacion y fortalecer su competitividad, con un servicio cercano, etico y orientado a resultados sostenibles.</w:t>
       </w:r>
     </w:p>
     <w:p>
+      <w:pPr>
+        <w:ind w:firstLine="0"/>
+      </w:pPr>
       <w:r>
         <w:rPr>
           <w:b/>
         </w:rPr>
-        <w:t>2. Construccion de la mision</w:t>
+        <w:t>Componentes de la mision</w:t>
       </w:r>
     </w:p>
     <w:p>
+      <w:pPr>
+        <w:ind w:firstLine="0"/>
+      </w:pPr>
       <w:r>
-        <w:t>Se analizan los 9 componentes propuestos para redactar una mision clara y completa:</w:t>
+        <w:rPr>
+          <w:i/>
+        </w:rPr>
+        <w:t>Tabla 1</w:t>
+      </w:r>
+    </w:p>
+    <w:p>
+      <w:pPr>
+        <w:ind w:firstLine="0"/>
+      </w:pPr>
+      <w:r>
+        <w:rPr>
+          <w:i/>
+        </w:rPr>
+        <w:t>Componentes para la construccion de la mision de Pangust Systems</w:t>
       </w:r>
     </w:p>
     <w:tbl>
@@ -78,38 +134,65 @@
         <w:tblLook w:firstColumn="1" w:firstRow="1" w:lastColumn="0" w:lastRow="0" w:noHBand="0" w:noVBand="1" w:val="04A0"/>
       </w:tblPr>
       <w:tblGrid>
-        <w:gridCol w:w="2880"/>
-        <w:gridCol w:w="2880"/>
-        <w:gridCol w:w="2880"/>
+        <w:gridCol w:w="3120"/>
+        <w:gridCol w:w="3120"/>
+        <w:gridCol w:w="3120"/>
       </w:tblGrid>
       <w:tr>
         <w:tc>
           <w:tcPr>
-            <w:tcW w:type="dxa" w:w="2880"/>
+            <w:tcW w:type="dxa" w:w="3120"/>
           </w:tcPr>
           <w:p>
+            <w:pPr>
+              <w:spacing w:line="240" w:lineRule="auto"/>
+              <w:ind w:firstLine="0"/>
+            </w:pPr>
             <w:r>
+              <w:rPr>
+                <w:rFonts w:ascii="Times New Roman" w:hAnsi="Times New Roman"/>
+                <w:b/>
+                <w:sz w:val="20"/>
+              </w:rPr>
               <w:t>Componente</w:t>
             </w:r>
           </w:p>
         </w:tc>
         <w:tc>
           <w:tcPr>
-            <w:tcW w:type="dxa" w:w="2880"/>
+            <w:tcW w:type="dxa" w:w="3120"/>
           </w:tcPr>
           <w:p>
+            <w:pPr>
+              <w:spacing w:line="240" w:lineRule="auto"/>
+              <w:ind w:firstLine="0"/>
+            </w:pPr>
             <w:r>
+              <w:rPr>
+                <w:rFonts w:ascii="Times New Roman" w:hAnsi="Times New Roman"/>
+                <w:b/>
+                <w:sz w:val="20"/>
+              </w:rPr>
               <w:t>Pregunta guia</w:t>
             </w:r>
           </w:p>
         </w:tc>
         <w:tc>
           <w:tcPr>
-            <w:tcW w:type="dxa" w:w="2880"/>
+            <w:tcW w:type="dxa" w:w="3120"/>
           </w:tcPr>
           <w:p>
+            <w:pPr>
+              <w:spacing w:line="240" w:lineRule="auto"/>
+              <w:ind w:firstLine="0"/>
+            </w:pPr>
             <w:r>
-              <w:t>Respuesta para Pangust Systems</w:t>
+              <w:rPr>
+                <w:rFonts w:ascii="Times New Roman" w:hAnsi="Times New Roman"/>
+                <w:b/>
+                <w:sz w:val="20"/>
+              </w:rPr>
+              <w:t>Respuesta</w:t>
             </w:r>
           </w:p>
         </w:tc>
@@ -117,30 +200,54 @@
       <w:tr>
         <w:tc>
           <w:tcPr>
-            <w:tcW w:type="dxa" w:w="2880"/>
+            <w:tcW w:type="dxa" w:w="3120"/>
           </w:tcPr>
           <w:p>
+            <w:pPr>
+              <w:spacing w:line="240" w:lineRule="auto"/>
+              <w:ind w:firstLine="0"/>
+            </w:pPr>
             <w:r>
-              <w:t>1. Clientes</w:t>
+              <w:rPr>
+                <w:rFonts w:ascii="Times New Roman" w:hAnsi="Times New Roman"/>
+                <w:sz w:val="20"/>
+              </w:rPr>
+              <w:t>Clientes</w:t>
             </w:r>
           </w:p>
         </w:tc>
         <w:tc>
           <w:tcPr>
-            <w:tcW w:type="dxa" w:w="2880"/>
+            <w:tcW w:type="dxa" w:w="3120"/>
           </w:tcPr>
           <w:p>
+            <w:pPr>
+              <w:spacing w:line="240" w:lineRule="auto"/>
+              <w:ind w:firstLine="0"/>
+            </w:pPr>
             <w:r>
+              <w:rPr>
+                <w:rFonts w:ascii="Times New Roman" w:hAnsi="Times New Roman"/>
+                <w:sz w:val="20"/>
+              </w:rPr>
               <w:t>¿Quienes son los clientes de la organizacion?</w:t>
             </w:r>
           </w:p>
         </w:tc>
         <w:tc>
           <w:tcPr>
-            <w:tcW w:type="dxa" w:w="2880"/>
+            <w:tcW w:type="dxa" w:w="3120"/>
           </w:tcPr>
           <w:p>
+            <w:pPr>
+              <w:spacing w:line="240" w:lineRule="auto"/>
+              <w:ind w:firstLine="0"/>
+            </w:pPr>
             <w:r>
+              <w:rPr>
+                <w:rFonts w:ascii="Times New Roman" w:hAnsi="Times New Roman"/>
+                <w:sz w:val="20"/>
+              </w:rPr>
               <w:t>Pymes que requieren digitalizacion, automatizacion y seguridad de informacion.</w:t>
             </w:r>
           </w:p>
@@ -149,30 +256,54 @@
       <w:tr>
         <w:tc>
           <w:tcPr>
-            <w:tcW w:type="dxa" w:w="2880"/>
+            <w:tcW w:type="dxa" w:w="3120"/>
           </w:tcPr>
           <w:p>
+            <w:pPr>
+              <w:spacing w:line="240" w:lineRule="auto"/>
+              <w:ind w:firstLine="0"/>
+            </w:pPr>
             <w:r>
-              <w:t>2. Productos o servicios</w:t>
+              <w:rPr>
+                <w:rFonts w:ascii="Times New Roman" w:hAnsi="Times New Roman"/>
+                <w:sz w:val="20"/>
+              </w:rPr>
+              <w:t>Productos o servicios</w:t>
             </w:r>
           </w:p>
         </w:tc>
         <w:tc>
           <w:tcPr>
-            <w:tcW w:type="dxa" w:w="2880"/>
+            <w:tcW w:type="dxa" w:w="3120"/>
           </w:tcPr>
           <w:p>
+            <w:pPr>
+              <w:spacing w:line="240" w:lineRule="auto"/>
+              <w:ind w:firstLine="0"/>
+            </w:pPr>
             <w:r>
+              <w:rPr>
+                <w:rFonts w:ascii="Times New Roman" w:hAnsi="Times New Roman"/>
+                <w:sz w:val="20"/>
+              </w:rPr>
               <w:t>¿Cuales son los principales bienes de la organizacion?</w:t>
             </w:r>
           </w:p>
         </w:tc>
         <w:tc>
           <w:tcPr>
-            <w:tcW w:type="dxa" w:w="2880"/>
+            <w:tcW w:type="dxa" w:w="3120"/>
           </w:tcPr>
           <w:p>
+            <w:pPr>
+              <w:spacing w:line="240" w:lineRule="auto"/>
+              <w:ind w:firstLine="0"/>
+            </w:pPr>
             <w:r>
+              <w:rPr>
+                <w:rFonts w:ascii="Times New Roman" w:hAnsi="Times New Roman"/>
+                <w:sz w:val="20"/>
+              </w:rPr>
               <w:t>Desarrollo de software empresarial, automatizacion de procesos, consultoria y soporte de ciberseguridad.</w:t>
             </w:r>
           </w:p>
@@ -181,30 +312,54 @@
       <w:tr>
         <w:tc>
           <w:tcPr>
-            <w:tcW w:type="dxa" w:w="2880"/>
+            <w:tcW w:type="dxa" w:w="3120"/>
           </w:tcPr>
           <w:p>
+            <w:pPr>
+              <w:spacing w:line="240" w:lineRule="auto"/>
+              <w:ind w:firstLine="0"/>
+            </w:pPr>
             <w:r>
-              <w:t>3. Mercados</w:t>
+              <w:rPr>
+                <w:rFonts w:ascii="Times New Roman" w:hAnsi="Times New Roman"/>
+                <w:sz w:val="20"/>
+              </w:rPr>
+              <w:t>Mercados</w:t>
             </w:r>
           </w:p>
         </w:tc>
         <w:tc>
           <w:tcPr>
-            <w:tcW w:type="dxa" w:w="2880"/>
+            <w:tcW w:type="dxa" w:w="3120"/>
           </w:tcPr>
           <w:p>
+            <w:pPr>
+              <w:spacing w:line="240" w:lineRule="auto"/>
+              <w:ind w:firstLine="0"/>
+            </w:pPr>
             <w:r>
+              <w:rPr>
+                <w:rFonts w:ascii="Times New Roman" w:hAnsi="Times New Roman"/>
+                <w:sz w:val="20"/>
+              </w:rPr>
               <w:t>¿Donde compite?</w:t>
             </w:r>
           </w:p>
         </w:tc>
         <w:tc>
           <w:tcPr>
-            <w:tcW w:type="dxa" w:w="2880"/>
+            <w:tcW w:type="dxa" w:w="3120"/>
           </w:tcPr>
           <w:p>
+            <w:pPr>
+              <w:spacing w:line="240" w:lineRule="auto"/>
+              <w:ind w:firstLine="0"/>
+            </w:pPr>
             <w:r>
+              <w:rPr>
+                <w:rFonts w:ascii="Times New Roman" w:hAnsi="Times New Roman"/>
+                <w:sz w:val="20"/>
+              </w:rPr>
               <w:t>Mercado local y regional de servicios TI para pymes en modalidad presencial y remota.</w:t>
             </w:r>
           </w:p>
@@ -213,30 +368,54 @@
       <w:tr>
         <w:tc>
           <w:tcPr>
-            <w:tcW w:type="dxa" w:w="2880"/>
+            <w:tcW w:type="dxa" w:w="3120"/>
           </w:tcPr>
           <w:p>
+            <w:pPr>
+              <w:spacing w:line="240" w:lineRule="auto"/>
+              <w:ind w:firstLine="0"/>
+            </w:pPr>
             <w:r>
-              <w:t>4. Tecnologia</w:t>
+              <w:rPr>
+                <w:rFonts w:ascii="Times New Roman" w:hAnsi="Times New Roman"/>
+                <w:sz w:val="20"/>
+              </w:rPr>
+              <w:t>Tecnologia</w:t>
             </w:r>
           </w:p>
         </w:tc>
         <w:tc>
           <w:tcPr>
-            <w:tcW w:type="dxa" w:w="2880"/>
+            <w:tcW w:type="dxa" w:w="3120"/>
           </w:tcPr>
           <w:p>
+            <w:pPr>
+              <w:spacing w:line="240" w:lineRule="auto"/>
+              <w:ind w:firstLine="0"/>
+            </w:pPr>
             <w:r>
+              <w:rPr>
+                <w:rFonts w:ascii="Times New Roman" w:hAnsi="Times New Roman"/>
+                <w:sz w:val="20"/>
+              </w:rPr>
               <w:t>¿Esta tecnologicamente actualizada?</w:t>
             </w:r>
           </w:p>
         </w:tc>
         <w:tc>
           <w:tcPr>
-            <w:tcW w:type="dxa" w:w="2880"/>
+            <w:tcW w:type="dxa" w:w="3120"/>
           </w:tcPr>
           <w:p>
+            <w:pPr>
+              <w:spacing w:line="240" w:lineRule="auto"/>
+              <w:ind w:firstLine="0"/>
+            </w:pPr>
             <w:r>
+              <w:rPr>
+                <w:rFonts w:ascii="Times New Roman" w:hAnsi="Times New Roman"/>
+                <w:sz w:val="20"/>
+              </w:rPr>
               <w:t>Si. Utiliza tecnologias cloud, desarrollo web moderno y buenas practicas de seguridad.</w:t>
             </w:r>
           </w:p>
@@ -245,30 +424,54 @@
       <w:tr>
         <w:tc>
           <w:tcPr>
-            <w:tcW w:type="dxa" w:w="2880"/>
+            <w:tcW w:type="dxa" w:w="3120"/>
           </w:tcPr>
           <w:p>
+            <w:pPr>
+              <w:spacing w:line="240" w:lineRule="auto"/>
+              <w:ind w:firstLine="0"/>
+            </w:pPr>
             <w:r>
-              <w:t>5. Supervivencia, crecimiento y rentabilidad</w:t>
+              <w:rPr>
+                <w:rFonts w:ascii="Times New Roman" w:hAnsi="Times New Roman"/>
+                <w:sz w:val="20"/>
+              </w:rPr>
+              <w:t>Supervivencia, crecimiento y rentabilidad</w:t>
             </w:r>
           </w:p>
         </w:tc>
         <w:tc>
           <w:tcPr>
-            <w:tcW w:type="dxa" w:w="2880"/>
+            <w:tcW w:type="dxa" w:w="3120"/>
           </w:tcPr>
           <w:p>
+            <w:pPr>
+              <w:spacing w:line="240" w:lineRule="auto"/>
+              <w:ind w:firstLine="0"/>
+            </w:pPr>
             <w:r>
+              <w:rPr>
+                <w:rFonts w:ascii="Times New Roman" w:hAnsi="Times New Roman"/>
+                <w:sz w:val="20"/>
+              </w:rPr>
               <w:t>¿Es rentable?</w:t>
             </w:r>
           </w:p>
         </w:tc>
         <w:tc>
           <w:tcPr>
-            <w:tcW w:type="dxa" w:w="2880"/>
+            <w:tcW w:type="dxa" w:w="3120"/>
           </w:tcPr>
           <w:p>
+            <w:pPr>
+              <w:spacing w:line="240" w:lineRule="auto"/>
+              <w:ind w:firstLine="0"/>
+            </w:pPr>
             <w:r>
+              <w:rPr>
+                <w:rFonts w:ascii="Times New Roman" w:hAnsi="Times New Roman"/>
+                <w:sz w:val="20"/>
+              </w:rPr>
               <w:t>Busca rentabilidad sostenible mediante proyectos escalables y contratos de soporte recurrente.</w:t>
             </w:r>
           </w:p>
@@ -277,30 +480,54 @@
       <w:tr>
         <w:tc>
           <w:tcPr>
-            <w:tcW w:type="dxa" w:w="2880"/>
+            <w:tcW w:type="dxa" w:w="3120"/>
           </w:tcPr>
           <w:p>
+            <w:pPr>
+              <w:spacing w:line="240" w:lineRule="auto"/>
+              <w:ind w:firstLine="0"/>
+            </w:pPr>
             <w:r>
-              <w:t>6. Filosofia</w:t>
+              <w:rPr>
+                <w:rFonts w:ascii="Times New Roman" w:hAnsi="Times New Roman"/>
+                <w:sz w:val="20"/>
+              </w:rPr>
+              <w:t>Filosofia</w:t>
             </w:r>
           </w:p>
         </w:tc>
         <w:tc>
           <w:tcPr>
-            <w:tcW w:type="dxa" w:w="2880"/>
+            <w:tcW w:type="dxa" w:w="3120"/>
           </w:tcPr>
           <w:p>
+            <w:pPr>
+              <w:spacing w:line="240" w:lineRule="auto"/>
+              <w:ind w:firstLine="0"/>
+            </w:pPr>
             <w:r>
+              <w:rPr>
+                <w:rFonts w:ascii="Times New Roman" w:hAnsi="Times New Roman"/>
+                <w:sz w:val="20"/>
+              </w:rPr>
               <w:t>¿Cuales son las creencias, valores y prioridades?</w:t>
             </w:r>
           </w:p>
         </w:tc>
         <w:tc>
           <w:tcPr>
-            <w:tcW w:type="dxa" w:w="2880"/>
+            <w:tcW w:type="dxa" w:w="3120"/>
           </w:tcPr>
           <w:p>
+            <w:pPr>
+              <w:spacing w:line="240" w:lineRule="auto"/>
+              <w:ind w:firstLine="0"/>
+            </w:pPr>
             <w:r>
+              <w:rPr>
+                <w:rFonts w:ascii="Times New Roman" w:hAnsi="Times New Roman"/>
+                <w:sz w:val="20"/>
+              </w:rPr>
               <w:t>Innovacion util, etica profesional, enfoque en resultados y mejora continua.</w:t>
             </w:r>
           </w:p>
@@ -309,31 +536,55 @@
       <w:tr>
         <w:tc>
           <w:tcPr>
-            <w:tcW w:type="dxa" w:w="2880"/>
+            <w:tcW w:type="dxa" w:w="3120"/>
           </w:tcPr>
           <w:p>
+            <w:pPr>
+              <w:spacing w:line="240" w:lineRule="auto"/>
+              <w:ind w:firstLine="0"/>
+            </w:pPr>
             <w:r>
-              <w:t>7. Concepto de si misma</w:t>
+              <w:rPr>
+                <w:rFonts w:ascii="Times New Roman" w:hAnsi="Times New Roman"/>
+                <w:sz w:val="20"/>
+              </w:rPr>
+              <w:t>Concepto de si misma</w:t>
             </w:r>
           </w:p>
         </w:tc>
         <w:tc>
           <w:tcPr>
-            <w:tcW w:type="dxa" w:w="2880"/>
+            <w:tcW w:type="dxa" w:w="3120"/>
           </w:tcPr>
           <w:p>
+            <w:pPr>
+              <w:spacing w:line="240" w:lineRule="auto"/>
+              <w:ind w:firstLine="0"/>
+            </w:pPr>
             <w:r>
+              <w:rPr>
+                <w:rFonts w:ascii="Times New Roman" w:hAnsi="Times New Roman"/>
+                <w:sz w:val="20"/>
+              </w:rPr>
               <w:t>¿Cual es la principal ventaja competitiva?</w:t>
             </w:r>
           </w:p>
         </w:tc>
         <w:tc>
           <w:tcPr>
-            <w:tcW w:type="dxa" w:w="2880"/>
+            <w:tcW w:type="dxa" w:w="3120"/>
           </w:tcPr>
           <w:p>
+            <w:pPr>
+              <w:spacing w:line="240" w:lineRule="auto"/>
+              <w:ind w:firstLine="0"/>
+            </w:pPr>
             <w:r>
-              <w:t>Integracion de software + automatizacion + ciberseguridad con atencion personalizada.</w:t>
+              <w:rPr>
+                <w:rFonts w:ascii="Times New Roman" w:hAnsi="Times New Roman"/>
+                <w:sz w:val="20"/>
+              </w:rPr>
+              <w:t>Integracion de software, automatizacion y ciberseguridad con atencion personalizada.</w:t>
             </w:r>
           </w:p>
         </w:tc>
@@ -341,31 +592,55 @@
       <w:tr>
         <w:tc>
           <w:tcPr>
-            <w:tcW w:type="dxa" w:w="2880"/>
+            <w:tcW w:type="dxa" w:w="3120"/>
           </w:tcPr>
           <w:p>
+            <w:pPr>
+              <w:spacing w:line="240" w:lineRule="auto"/>
+              <w:ind w:firstLine="0"/>
+            </w:pPr>
             <w:r>
-              <w:t>8. Imagen publica</w:t>
+              <w:rPr>
+                <w:rFonts w:ascii="Times New Roman" w:hAnsi="Times New Roman"/>
+                <w:sz w:val="20"/>
+              </w:rPr>
+              <w:t>Imagen publica</w:t>
             </w:r>
           </w:p>
         </w:tc>
         <w:tc>
           <w:tcPr>
-            <w:tcW w:type="dxa" w:w="2880"/>
+            <w:tcW w:type="dxa" w:w="3120"/>
           </w:tcPr>
           <w:p>
+            <w:pPr>
+              <w:spacing w:line="240" w:lineRule="auto"/>
+              <w:ind w:firstLine="0"/>
+            </w:pPr>
             <w:r>
+              <w:rPr>
+                <w:rFonts w:ascii="Times New Roman" w:hAnsi="Times New Roman"/>
+                <w:sz w:val="20"/>
+              </w:rPr>
               <w:t>¿Se preocupa por temas sociales y ambientales?</w:t>
             </w:r>
           </w:p>
         </w:tc>
         <w:tc>
           <w:tcPr>
-            <w:tcW w:type="dxa" w:w="2880"/>
+            <w:tcW w:type="dxa" w:w="3120"/>
           </w:tcPr>
           <w:p>
+            <w:pPr>
+              <w:spacing w:line="240" w:lineRule="auto"/>
+              <w:ind w:firstLine="0"/>
+            </w:pPr>
             <w:r>
-              <w:t>Si. Promueve uso responsable de tecnologia, proteccion de datos y practica laboral etica.</w:t>
+              <w:rPr>
+                <w:rFonts w:ascii="Times New Roman" w:hAnsi="Times New Roman"/>
+                <w:sz w:val="20"/>
+              </w:rPr>
+              <w:t>Promueve uso responsable de tecnologia, proteccion de datos y practica laboral etica.</w:t>
             </w:r>
           </w:p>
         </w:tc>
@@ -373,31 +648,55 @@
       <w:tr>
         <w:tc>
           <w:tcPr>
-            <w:tcW w:type="dxa" w:w="2880"/>
+            <w:tcW w:type="dxa" w:w="3120"/>
           </w:tcPr>
           <w:p>
+            <w:pPr>
+              <w:spacing w:line="240" w:lineRule="auto"/>
+              <w:ind w:firstLine="0"/>
+            </w:pPr>
             <w:r>
-              <w:t>9. Empleados</w:t>
+              <w:rPr>
+                <w:rFonts w:ascii="Times New Roman" w:hAnsi="Times New Roman"/>
+                <w:sz w:val="20"/>
+              </w:rPr>
+              <w:t>Empleados</w:t>
             </w:r>
           </w:p>
         </w:tc>
         <w:tc>
           <w:tcPr>
-            <w:tcW w:type="dxa" w:w="2880"/>
+            <w:tcW w:type="dxa" w:w="3120"/>
           </w:tcPr>
           <w:p>
+            <w:pPr>
+              <w:spacing w:line="240" w:lineRule="auto"/>
+              <w:ind w:firstLine="0"/>
+            </w:pPr>
             <w:r>
+              <w:rPr>
+                <w:rFonts w:ascii="Times New Roman" w:hAnsi="Times New Roman"/>
+                <w:sz w:val="20"/>
+              </w:rPr>
               <w:t>¿Son los empleados un activo valioso?</w:t>
             </w:r>
           </w:p>
         </w:tc>
         <w:tc>
           <w:tcPr>
-            <w:tcW w:type="dxa" w:w="2880"/>
+            <w:tcW w:type="dxa" w:w="3120"/>
           </w:tcPr>
           <w:p>
+            <w:pPr>
+              <w:spacing w:line="240" w:lineRule="auto"/>
+              <w:ind w:firstLine="0"/>
+            </w:pPr>
             <w:r>
-              <w:t>Si. Prioriza formacion, bienestar y retencion del talento tecnico.</w:t>
+              <w:rPr>
+                <w:rFonts w:ascii="Times New Roman" w:hAnsi="Times New Roman"/>
+                <w:sz w:val="20"/>
+              </w:rPr>
+              <w:t>Prioriza formacion, bienestar y retencion del talento tecnico.</w:t>
             </w:r>
           </w:p>
         </w:tc>
@@ -405,47 +704,14 @@
     </w:tbl>
     <w:p/>
     <w:p>
+      <w:pPr>
+        <w:ind w:firstLine="0"/>
+      </w:pPr>
       <w:r>
         <w:rPr>
           <w:b/>
         </w:rPr>
-        <w:t>Mision propuesta</w:t>
-      </w:r>
-    </w:p>
-    <w:p>
-      <w:r>
-        <w:t>Desarrollar soluciones tecnologicas integrales para pymes, combinando software, automatizacion y ciberseguridad, para mejorar su eficiencia, proteger su informacion y fortalecer su competitividad, con un servicio cercano, etico y orientado a resultados sostenibles.</w:t>
-      </w:r>
-    </w:p>
-    <w:p>
-      <w:r>
-        <w:rPr>
-          <w:b/>
-        </w:rPr>
-        <w:t>3. Valores organizacionales</w:t>
-      </w:r>
-    </w:p>
-    <w:p>
-      <w:r>
-        <w:t>- Innovacion con proposito: Aplicamos tecnologia que resuelve problemas reales del cliente y aporta valor medible.</w:t>
-      </w:r>
-    </w:p>
-    <w:p>
-      <w:r>
-        <w:t>- Compromiso con la seguridad: Protegemos la informacion y la continuidad operativa de nuestros clientes con buenas practicas tecnicas y eticas.</w:t>
-      </w:r>
-    </w:p>
-    <w:p>
-      <w:r>
-        <w:t>- Orientacion al cliente: Escuchamos, acompanamos y adaptamos cada solucion al contexto y objetivos de cada pyme.</w:t>
-      </w:r>
-    </w:p>
-    <w:p>
-      <w:r>
-        <w:rPr>
-          <w:b/>
-        </w:rPr>
-        <w:t>4. Vision organizacional</w:t>
+        <w:t>Vision</w:t>
       </w:r>
     </w:p>
     <w:p>
@@ -454,11 +720,36 @@
       </w:r>
     </w:p>
     <w:p>
+      <w:pPr>
+        <w:ind w:firstLine="0"/>
+      </w:pPr>
       <w:r>
         <w:rPr>
           <w:b/>
         </w:rPr>
-        <w:t>5. Justificacion de la vision (escala tipo Likert)</w:t>
+        <w:t>Validacion de la vision</w:t>
+      </w:r>
+    </w:p>
+    <w:p>
+      <w:pPr>
+        <w:ind w:firstLine="0"/>
+      </w:pPr>
+      <w:r>
+        <w:rPr>
+          <w:i/>
+        </w:rPr>
+        <w:t>Tabla 2</w:t>
+      </w:r>
+    </w:p>
+    <w:p>
+      <w:pPr>
+        <w:ind w:firstLine="0"/>
+      </w:pPr>
+      <w:r>
+        <w:rPr>
+          <w:i/>
+        </w:rPr>
+        <w:t>Resultados de la escala tipo Likert para la vision</w:t>
       </w:r>
     </w:p>
     <w:tbl>
@@ -467,71 +758,45 @@
         <w:tblLook w:firstColumn="1" w:firstRow="1" w:lastColumn="0" w:lastRow="0" w:noHBand="0" w:noVBand="1" w:val="04A0"/>
       </w:tblPr>
       <w:tblGrid>
-        <w:gridCol w:w="1440"/>
-        <w:gridCol w:w="1440"/>
-        <w:gridCol w:w="1440"/>
-        <w:gridCol w:w="1440"/>
-        <w:gridCol w:w="1440"/>
-        <w:gridCol w:w="1440"/>
+        <w:gridCol w:w="4680"/>
+        <w:gridCol w:w="4680"/>
       </w:tblGrid>
       <w:tr>
         <w:tc>
           <w:tcPr>
-            <w:tcW w:type="dxa" w:w="1440"/>
+            <w:tcW w:type="dxa" w:w="4680"/>
           </w:tcPr>
           <w:p>
+            <w:pPr>
+              <w:spacing w:line="240" w:lineRule="auto"/>
+              <w:ind w:firstLine="0"/>
+            </w:pPr>
             <w:r>
+              <w:rPr>
+                <w:rFonts w:ascii="Times New Roman" w:hAnsi="Times New Roman"/>
+                <w:b/>
+                <w:sz w:val="20"/>
+              </w:rPr>
               <w:t>Enunciado</w:t>
             </w:r>
           </w:p>
         </w:tc>
         <w:tc>
           <w:tcPr>
-            <w:tcW w:type="dxa" w:w="1440"/>
+            <w:tcW w:type="dxa" w:w="4680"/>
           </w:tcPr>
           <w:p>
+            <w:pPr>
+              <w:spacing w:line="240" w:lineRule="auto"/>
+              <w:ind w:firstLine="0"/>
+            </w:pPr>
             <w:r>
-              <w:t>Totalmente de acuerdo</w:t>
-            </w:r>
-          </w:p>
-        </w:tc>
-        <w:tc>
-          <w:tcPr>
-            <w:tcW w:type="dxa" w:w="1440"/>
-          </w:tcPr>
-          <w:p>
-            <w:r>
-              <w:t>De acuerdo</w:t>
-            </w:r>
-          </w:p>
-        </w:tc>
-        <w:tc>
-          <w:tcPr>
-            <w:tcW w:type="dxa" w:w="1440"/>
-          </w:tcPr>
-          <w:p>
-            <w:r>
-              <w:t>Ni de acuerdo ni en desacuerdo</w:t>
-            </w:r>
-          </w:p>
-        </w:tc>
-        <w:tc>
-          <w:tcPr>
-            <w:tcW w:type="dxa" w:w="1440"/>
-          </w:tcPr>
-          <w:p>
-            <w:r>
-              <w:t>En desacuerdo</w:t>
-            </w:r>
-          </w:p>
-        </w:tc>
-        <w:tc>
-          <w:tcPr>
-            <w:tcW w:type="dxa" w:w="1440"/>
-          </w:tcPr>
-          <w:p>
-            <w:r>
-              <w:t>Totalmente en desacuerdo</w:t>
+              <w:rPr>
+                <w:rFonts w:ascii="Times New Roman" w:hAnsi="Times New Roman"/>
+                <w:b/>
+                <w:sz w:val="20"/>
+              </w:rPr>
+              <w:t>Respuesta</w:t>
             </w:r>
           </w:p>
         </w:tc>
@@ -539,205 +804,257 @@
       <w:tr>
         <w:tc>
           <w:tcPr>
-            <w:tcW w:type="dxa" w:w="1440"/>
+            <w:tcW w:type="dxa" w:w="4680"/>
           </w:tcPr>
           <w:p>
+            <w:pPr>
+              <w:spacing w:line="240" w:lineRule="auto"/>
+              <w:ind w:firstLine="0"/>
+            </w:pPr>
             <w:r>
+              <w:rPr>
+                <w:rFonts w:ascii="Times New Roman" w:hAnsi="Times New Roman"/>
+                <w:sz w:val="20"/>
+              </w:rPr>
               <w:t>Conocemos el ideal de crecimiento planteado por los fundadores.</w:t>
             </w:r>
           </w:p>
         </w:tc>
         <w:tc>
           <w:tcPr>
-            <w:tcW w:type="dxa" w:w="1440"/>
+            <w:tcW w:type="dxa" w:w="4680"/>
           </w:tcPr>
           <w:p>
+            <w:pPr>
+              <w:spacing w:line="240" w:lineRule="auto"/>
+              <w:ind w:firstLine="0"/>
+            </w:pPr>
             <w:r>
-              <w:t>X</w:t>
+              <w:rPr>
+                <w:rFonts w:ascii="Times New Roman" w:hAnsi="Times New Roman"/>
+                <w:sz w:val="20"/>
+              </w:rPr>
+              <w:t>Totalmente de acuerdo</w:t>
             </w:r>
-          </w:p>
-        </w:tc>
-        <w:tc>
-          <w:tcPr>
-            <w:tcW w:type="dxa" w:w="1440"/>
-          </w:tcPr>
-          <w:p>
-            <w:r/>
-          </w:p>
-        </w:tc>
-        <w:tc>
-          <w:tcPr>
-            <w:tcW w:type="dxa" w:w="1440"/>
-          </w:tcPr>
-          <w:p>
-            <w:r/>
-          </w:p>
-        </w:tc>
-        <w:tc>
-          <w:tcPr>
-            <w:tcW w:type="dxa" w:w="1440"/>
-          </w:tcPr>
-          <w:p>
-            <w:r/>
-          </w:p>
-        </w:tc>
-        <w:tc>
-          <w:tcPr>
-            <w:tcW w:type="dxa" w:w="1440"/>
-          </w:tcPr>
-          <w:p>
-            <w:r/>
           </w:p>
         </w:tc>
       </w:tr>
       <w:tr>
         <w:tc>
           <w:tcPr>
-            <w:tcW w:type="dxa" w:w="1440"/>
+            <w:tcW w:type="dxa" w:w="4680"/>
           </w:tcPr>
           <w:p>
+            <w:pPr>
+              <w:spacing w:line="240" w:lineRule="auto"/>
+              <w:ind w:firstLine="0"/>
+            </w:pPr>
             <w:r>
+              <w:rPr>
+                <w:rFonts w:ascii="Times New Roman" w:hAnsi="Times New Roman"/>
+                <w:sz w:val="20"/>
+              </w:rPr>
               <w:t>En la empresa esta presente la imagen deseada para el futuro.</w:t>
             </w:r>
           </w:p>
         </w:tc>
         <w:tc>
           <w:tcPr>
-            <w:tcW w:type="dxa" w:w="1440"/>
+            <w:tcW w:type="dxa" w:w="4680"/>
           </w:tcPr>
           <w:p>
-            <w:r/>
-          </w:p>
-        </w:tc>
-        <w:tc>
-          <w:tcPr>
-            <w:tcW w:type="dxa" w:w="1440"/>
-          </w:tcPr>
-          <w:p>
+            <w:pPr>
+              <w:spacing w:line="240" w:lineRule="auto"/>
+              <w:ind w:firstLine="0"/>
+            </w:pPr>
             <w:r>
-              <w:t>X</w:t>
+              <w:rPr>
+                <w:rFonts w:ascii="Times New Roman" w:hAnsi="Times New Roman"/>
+                <w:sz w:val="20"/>
+              </w:rPr>
+              <w:t>De acuerdo</w:t>
             </w:r>
-          </w:p>
-        </w:tc>
-        <w:tc>
-          <w:tcPr>
-            <w:tcW w:type="dxa" w:w="1440"/>
-          </w:tcPr>
-          <w:p>
-            <w:r/>
-          </w:p>
-        </w:tc>
-        <w:tc>
-          <w:tcPr>
-            <w:tcW w:type="dxa" w:w="1440"/>
-          </w:tcPr>
-          <w:p>
-            <w:r/>
-          </w:p>
-        </w:tc>
-        <w:tc>
-          <w:tcPr>
-            <w:tcW w:type="dxa" w:w="1440"/>
-          </w:tcPr>
-          <w:p>
-            <w:r/>
           </w:p>
         </w:tc>
       </w:tr>
       <w:tr>
         <w:tc>
           <w:tcPr>
-            <w:tcW w:type="dxa" w:w="1440"/>
+            <w:tcW w:type="dxa" w:w="4680"/>
           </w:tcPr>
           <w:p>
+            <w:pPr>
+              <w:spacing w:line="240" w:lineRule="auto"/>
+              <w:ind w:firstLine="0"/>
+            </w:pPr>
             <w:r>
+              <w:rPr>
+                <w:rFonts w:ascii="Times New Roman" w:hAnsi="Times New Roman"/>
+                <w:sz w:val="20"/>
+              </w:rPr>
               <w:t>Creemos que la empresa sera perdurable porque tiene una meta de gran alcance.</w:t>
             </w:r>
           </w:p>
         </w:tc>
         <w:tc>
           <w:tcPr>
-            <w:tcW w:type="dxa" w:w="1440"/>
+            <w:tcW w:type="dxa" w:w="4680"/>
           </w:tcPr>
           <w:p>
-            <w:r/>
-          </w:p>
-        </w:tc>
-        <w:tc>
-          <w:tcPr>
-            <w:tcW w:type="dxa" w:w="1440"/>
-          </w:tcPr>
-          <w:p>
+            <w:pPr>
+              <w:spacing w:line="240" w:lineRule="auto"/>
+              <w:ind w:firstLine="0"/>
+            </w:pPr>
             <w:r>
-              <w:t>X</w:t>
+              <w:rPr>
+                <w:rFonts w:ascii="Times New Roman" w:hAnsi="Times New Roman"/>
+                <w:sz w:val="20"/>
+              </w:rPr>
+              <w:t>De acuerdo</w:t>
             </w:r>
-          </w:p>
-        </w:tc>
-        <w:tc>
-          <w:tcPr>
-            <w:tcW w:type="dxa" w:w="1440"/>
-          </w:tcPr>
-          <w:p>
-            <w:r/>
-          </w:p>
-        </w:tc>
-        <w:tc>
-          <w:tcPr>
-            <w:tcW w:type="dxa" w:w="1440"/>
-          </w:tcPr>
-          <w:p>
-            <w:r/>
-          </w:p>
-        </w:tc>
-        <w:tc>
-          <w:tcPr>
-            <w:tcW w:type="dxa" w:w="1440"/>
-          </w:tcPr>
-          <w:p>
-            <w:r/>
           </w:p>
         </w:tc>
       </w:tr>
     </w:tbl>
+    <w:p/>
     <w:p>
+      <w:pPr>
+        <w:ind w:firstLine="0"/>
+      </w:pPr>
       <w:r>
         <w:rPr>
           <w:b/>
         </w:rPr>
-        <w:t>6. Conclusion</w:t>
+        <w:t>Valores</w:t>
+      </w:r>
+    </w:p>
+    <w:p>
+      <w:pPr>
+        <w:ind w:firstLine="720"/>
+      </w:pPr>
+      <w:r>
+        <w:t>Innovacion con proposito: Aplicamos tecnologia para resolver problemas reales del cliente y aportar valor medible.</w:t>
+      </w:r>
+    </w:p>
+    <w:p>
+      <w:pPr>
+        <w:ind w:firstLine="720"/>
+      </w:pPr>
+      <w:r>
+        <w:t>Compromiso con la seguridad: Protegemos la informacion y la continuidad operativa mediante buenas practicas tecnicas y eticas.</w:t>
+      </w:r>
+    </w:p>
+    <w:p>
+      <w:pPr>
+        <w:ind w:firstLine="720"/>
+      </w:pPr>
+      <w:r>
+        <w:t>Orientacion al cliente: Adaptamos cada solucion al contexto y objetivos de cada pyme con acompanamiento continuo.</w:t>
+      </w:r>
+    </w:p>
+    <w:p>
+      <w:pPr>
+        <w:ind w:firstLine="0"/>
+      </w:pPr>
+      <w:r>
+        <w:rPr>
+          <w:b/>
+        </w:rPr>
+        <w:t>Conclusion</w:t>
       </w:r>
     </w:p>
     <w:p>
       <w:r>
-        <w:t>La mision, la vision y los valores definidos para Pangust Systems mantienen coherencia interna y establecen una direccion estrategica clara para los proximos cinco anos. Esta base permite al equipo tomar decisiones alineadas con el crecimiento, la calidad del servicio y la sostenibilidad del negocio.</w:t>
+        <w:t>La mision, la vision y los valores definidos para Pangust Systems mantienen coherencia interna y establecen una direccion estrategica clara para los proximos cinco anos. Esta base permite tomar decisiones alineadas con el crecimiento, la calidad del servicio y la sostenibilidad del negocio.</w:t>
       </w:r>
     </w:p>
     <w:p>
+      <w:pPr>
+        <w:ind w:firstLine="0"/>
+        <w:jc w:val="center"/>
+      </w:pPr>
       <w:r>
         <w:rPr>
           <w:b/>
         </w:rPr>
-        <w:t>Bibliografia</w:t>
+        <w:t>Referencias</w:t>
       </w:r>
     </w:p>
     <w:p>
+      <w:pPr>
+        <w:ind w:hanging="720" w:left="720"/>
+      </w:pPr>
+      <w:r>
+        <w:t>Asana. (2025, 1 de julio). Analisis FODA: que es y como usarlo (con ejemplos). https://asana.com/es/resources/swot-analysis</w:t>
+      </w:r>
+    </w:p>
+    <w:p>
+      <w:pPr>
+        <w:ind w:hanging="720" w:left="720"/>
+      </w:pPr>
+      <w:r>
+        <w:t>Buk. (s. f.). Valores corporativos y cultura organizacional. Recuperado el 22 de abril de 2026, de https://www.buk.co/blog/valores-corporativos-y-cultura-organizacional</w:t>
+      </w:r>
+    </w:p>
+    <w:p>
+      <w:pPr>
+        <w:ind w:hanging="720" w:left="720"/>
+      </w:pPr>
+      <w:r>
+        <w:t>CEREM. (s. f.). Cultura organizacional: caracteristicas y componentes. Recuperado el 22 de abril de 2026, de https://www.cerem.es/blog/cultura-organizacional-caracteristicas-y-componentes/</w:t>
+      </w:r>
+    </w:p>
+    <w:p>
+      <w:pPr>
+        <w:ind w:hanging="720" w:left="720"/>
+      </w:pPr>
       <w:r>
         <w:t>Garcia, S. L. N. (2000). Organizacion total. McGraw-Hill Interamericana.</w:t>
       </w:r>
     </w:p>
     <w:p>
+      <w:pPr>
+        <w:ind w:hanging="720" w:left="720"/>
+      </w:pPr>
+      <w:r>
+        <w:t>Monografias.com. (s. f.). Mision, vision y analisis FODA. Recuperado el 22 de abril de 2026, de https://www.monografias.com/trabajos85/mision-vision-analisis-foda/mision-vision-analisis-foda</w:t>
+      </w:r>
+    </w:p>
+    <w:p>
+      <w:pPr>
+        <w:ind w:hanging="720" w:left="720"/>
+      </w:pPr>
+      <w:r>
+        <w:t>Pretium Consulting. (2025, 12 de septiembre). Elaboracion de la mision empresarial. https://www.pretiumperu.com/post/elaboracion-de-la-mision-empresarial</w:t>
+      </w:r>
+    </w:p>
+    <w:p>
+      <w:pPr>
+        <w:ind w:hanging="720" w:left="720"/>
+      </w:pPr>
+      <w:r>
+        <w:t>Scribd. (s. f.). 6 componentes de la mision. Recuperado el 22 de abril de 2026, de https://es.scribd.com/document/434926684/6-Componentes-de-La-Mision</w:t>
+      </w:r>
+    </w:p>
+    <w:p>
+      <w:pPr>
+        <w:ind w:hanging="720" w:left="720"/>
+      </w:pPr>
       <w:r>
         <w:t>Thompson, A. A. (2017). Administracion estrategica: Teoria y casos.</w:t>
       </w:r>
     </w:p>
     <w:p>
+      <w:pPr>
+        <w:ind w:hanging="720" w:left="720"/>
+      </w:pPr>
       <w:r>
         <w:t>Torres Hernandez, Z. (2015). Administracion estrategica. Grupo Editorial Patria.</w:t>
       </w:r>
     </w:p>
     <w:sectPr>
       <w:pgSz w:w="12240" w:h="15840"/>
-      <w:pgMar w:top="1440" w:right="1800" w:bottom="1440" w:left="1800" w:header="720" w:footer="720" w:gutter="0"/>
+      <w:pgMar w:top="1440" w:right="1440" w:bottom="1440" w:left="1440" w:header="720" w:footer="720" w:gutter="0"/>
       <w:cols w:space="720"/>
       <w:docGrid w:linePitch="360"/>
     </w:sectPr>
@@ -1109,10 +1426,11 @@
     <w:qFormat/>
     <w:rsid w:val="00FC693F"/>
     <w:pPr>
-      <w:spacing w:line="360" w:lineRule="auto"/>
+      <w:spacing w:line="480" w:lineRule="auto" w:after="0" w:before="0"/>
+      <w:ind w:firstLine="720"/>
     </w:pPr>
     <w:rPr>
-      <w:rFonts w:ascii="Calibri" w:hAnsi="Calibri"/>
+      <w:rFonts w:ascii="Times New Roman" w:hAnsi="Times New Roman" w:eastAsia="Times New Roman"/>
       <w:sz w:val="24"/>
     </w:rPr>
   </w:style>

</xml_diff>